<commit_message>
Fill COVERAGE (16/16 head-CT findings vs Babiarz ref6; VST is a label) + ED9d indication effect (0.80->0.76); only ablation tokens remain
</commit_message>
<xml_diff>
--- a/incoming/edited/NeuroVFM_Matters_Arising_manuscript_FILLED.docx
+++ b/incoming/edited/NeuroVFM_Matters_Arising_manuscript_FILLED.docx
@@ -531,7 +531,7 @@
           <w:highlight w:val="yellow"/>
           <w:highlightCs w:val="yellow"/>
         </w:rPr>
-        <w:t xml:space="preserve">{{THEIR_ED9D_INDICATION_EFFECT}}</w:t>
+        <w:t>a small reduction in NeuroVFM’s three-tier acuity accuracy (approximately 0.80 to 0.76)</w:t>
       </w:r>
       <w:r>
         <w:rPr>
@@ -1384,7 +1384,7 @@
           <w:highlight w:val="yellow"/>
           <w:highlightCs w:val="yellow"/>
         </w:rPr>
-        <w:t>all nine of the critical findings analysed here; of a broader neuroradiology critical-findings list (ref. 6), cerebral venous sinus thrombosis was the only commonly listed urgent finding without a corresponding NeuroVFM label</w:t>
+        <w:t>all head-CT-assessable critical findings on the list (16 of its 40 entries, including hemorrhage, acute stroke, herniation, hydrocephalus, mass effect, edema, aneurysm, arteriovenous malformation, venous sinus thrombosis, vascular dissection and occlusion, skull fracture, pneumocephalus, abscess and foreign body); the remaining entries are spinal or soft-tissue findings outside the scope of a non-contrast head CT</w:t>
       </w:r>
       <w:r>
         <w:rPr>

</xml_diff>

<commit_message>
Fig1 -> 3 panels (drop 2x2 'wash', big decoding strip = the strength; cleaner panel-b annotation); update legends + Fig refs; rebuild package
</commit_message>
<xml_diff>
--- a/incoming/edited/NeuroVFM_Matters_Arising_manuscript_FILLED.docx
+++ b/incoming/edited/NeuroVFM_Matters_Arising_manuscript_FILLED.docx
@@ -473,7 +473,7 @@
         <w:spacing w:after="200" w:line="276"/>
       </w:pPr>
       <w:r>
-        <w:t>The misses of the report pipeline show where information was lost. Of the 55 urgent studies it missed, 5 had a report that named a critical finding that GPT-5 did not escalate. Of the remainder, in 40 the classifier scored the missed finding above 0.5 (median 0.92) while the report named none of the study’s critical findings, and in 10 the classifier also scored the finding at or below 0.5. Most of these silent reports read as explicitly normal, for example, “Study is unremarkable.” They were complete outputs rather than truncated or empty generations, and the language model had received the same bone window as the classifier. The omitted findings included calvarial fracture, intraparenchymal hemorrhage, subdural hematoma and mass effect (Extended Data Fig. 1). A normal-reading report is more consequential than a missing flag, because it reassures and moves a scan down the worklist. Under the original evaluation these studies would count as failures of perception, although the encoder had represented the finding.</w:t>
+        <w:t>The misses of the report pipeline show where information was lost. Of the 55 urgent studies it missed, 5 had a report that named a critical finding that GPT-5 did not escalate. Of the remainder, in 40 the classifier scored the missed finding above 0.5 (median 0.92) while the report named none of the study’s critical findings (Fig. 1c), and in 10 the classifier also scored the finding at or below 0.5. Most of these silent reports read as explicitly normal, for example, “Study is unremarkable.” They were complete outputs rather than truncated or empty generations, and the language model had received the same bone window as the classifier. The omitted findings included calvarial fracture, intraparenchymal hemorrhage, subdural hematoma and mass effect (Extended Data Fig. 1). A normal-reading report is more consequential than a missing flag, because it reassures and moves a scan down the worklist. Under the original evaluation these studies would count as failures of perception, although the encoder had represented the finding.</w:t>
       </w:r>
     </w:p>
     <w:p>
@@ -1077,7 +1077,7 @@
         <w:t xml:space="preserve">Fig. 1. </w:t>
       </w:r>
       <w:r>
-        <w:t>NeuroVFM’s diagnostic classifier detects most urgent findings that its written reports omit, so report-based evaluation does not isolate perception. a, The released NeuroVFM system and the change we evaluated. One frozen encoder feeds two readouts that do not share information. In the original study, perception and triage were evaluated through the report path, in which a 14-billion-parameter language model writes findings that GPT-5 reads to assign acuity (orange). We also read the diagnostic classifier (about 0.95 million parameters) directly (blue). Shown for one CQ500 study with subarachnoid hemorrhage: the classifier scored the finding at 0.99 and flagged the study, whereas the generated report read “Study is unremarkable.” and the study was not escalated. b, Sensitivity for urgent studies versus fraction of studies flagged (n = 472, 206 urgent). Blue curve and band, the classifier’s highest score across the nine critical findings used directly as a triage score, with 95% CI (AUROC 0.949, 95% CI 0.928–0.967). Orange point, the report pipeline (sensitivity 0.733 at a flag rate of 0.341). Blue point, the classifier at the same flag rate, a threshold chosen without labels. The difference in sensitivity was 0.000 (95% CI −0.029 to 0.030). c, Agreement between the two readouts on the 206 urgent studies at the matched flag rate: caught by both (134), by the classifier only (17), by the report only (17) or by neither (38). d, Classifier score on the missed finding for each of the 55 urgent studies the report pipeline missed. Dotted line, 0.5 (the primary decoding threshold); solid line, the matched triage threshold (0.98). Filled blue markers, decoding misses, in which the classifier scored the missed finding above 0.5 while the report named none of the study’s critical findings (n = 40). Grey markers, perception misses, in which that score was 0.5 or below (n = 10). Open markers, reasoning misses, in which the report named a critical finding that GPT-5 did not escalate (n = 5). Confidence intervals are from 2,000 study-level bootstrap resamples.</w:t>
+        <w:t>NeuroVFM’s diagnostic classifier detects most urgent findings that its written reports omit, so report-based evaluation does not isolate perception. a, The released NeuroVFM system and the change we evaluated. One frozen encoder feeds two readouts that do not share information. In the original study, perception and triage were evaluated through the report path, in which a 14-billion-parameter language model writes findings that GPT-5 reads to assign acuity (orange). We also read the diagnostic classifier (about 0.95 million parameters) directly (blue). Shown for one CQ500 study with subarachnoid hemorrhage: the classifier scored the finding at 0.99 and flagged the study, whereas the generated report read “Study is unremarkable.” and the study was not escalated. b, Sensitivity for urgent studies versus fraction of studies flagged (n = 472, 206 urgent). Blue curve and band, the classifier’s highest score across the nine critical findings used directly as a triage score, with 95% CI (AUROC 0.949, 95% CI 0.928–0.967). Orange point, the report pipeline (sensitivity 0.733 at a flag rate of 0.341). Blue point, the classifier at the same flag rate, a threshold chosen without labels; the difference in sensitivity was 0.000 (95% CI −0.029 to 0.030). c, Classifier score on the missed finding for the 40 decoding misses — urgent studies the report pipeline missed in which the classifier scored the finding above 0.5 while the report named none of the study’s critical findings. Dotted line, 0.5; the median score was 0.92, and in 38 of the 40 the report named none of the nine critical findings. Confidence intervals in b are from 2,000 study-level bootstrap resamples.</w:t>
       </w:r>
     </w:p>
     <w:p>

</xml_diff>

<commit_message>
Remove stale Fig 1c ref from 2x2 sentence (2x2 now text-only); rebuild package
</commit_message>
<xml_diff>
--- a/incoming/edited/NeuroVFM_Matters_Arising_manuscript_FILLED.docx
+++ b/incoming/edited/NeuroVFM_Matters_Arising_manuscript_FILLED.docx
@@ -388,84 +388,7 @@
         <w:spacing w:after="200" w:line="276"/>
       </w:pPr>
       <w:r>
-        <w:rPr>
-          <w:rFonts w:ascii="Arial" w:cs="Arial" w:eastAsia="Arial" w:hAnsi="Arial"/>
-          <w:sz w:val="22"/>
-          <w:szCs w:val="22"/>
-        </w:rPr>
-        <w:t xml:space="preserve">Read directly, the classifier separated urgent from non-urgent studies with an area under the receiver operating characteristic curve of 0.949 (95% CI 0.928–0.967; Fig. 1b). The report pipeline flagged 34.1% of studies and detected 73.3% of urgent studies. At the same flag rate, the classifier detected the same fraction (difference 0.000, 95% CI −0.029 to 0.030). Equal sensitivity did not mean identical errors. Of the 206 urgent studies, </w:t>
-      </w:r>
-      <w:r>
-        <w:rPr>
-          <w:rFonts w:ascii="Arial" w:cs="Arial" w:eastAsia="Arial" w:hAnsi="Arial"/>
-          <w:sz w:val="22"/>
-          <w:szCs w:val="22"/>
-          <w:highlight w:val="yellow"/>
-          <w:highlightCs w:val="yellow"/>
-        </w:rPr>
-        <w:t>134</w:t>
-      </w:r>
-      <w:r>
-        <w:rPr>
-          <w:rFonts w:ascii="Arial" w:cs="Arial" w:eastAsia="Arial" w:hAnsi="Arial"/>
-          <w:sz w:val="22"/>
-          <w:szCs w:val="22"/>
-        </w:rPr>
-        <w:t xml:space="preserve"> were caught by both readouts and </w:t>
-      </w:r>
-      <w:r>
-        <w:rPr>
-          <w:rFonts w:ascii="Arial" w:cs="Arial" w:eastAsia="Arial" w:hAnsi="Arial"/>
-          <w:sz w:val="22"/>
-          <w:szCs w:val="22"/>
-          <w:highlight w:val="yellow"/>
-          <w:highlightCs w:val="yellow"/>
-        </w:rPr>
-        <w:t>38</w:t>
-      </w:r>
-      <w:r>
-        <w:rPr>
-          <w:rFonts w:ascii="Arial" w:cs="Arial" w:eastAsia="Arial" w:hAnsi="Arial"/>
-          <w:sz w:val="22"/>
-          <w:szCs w:val="22"/>
-        </w:rPr>
-        <w:t xml:space="preserve"> by neither, while </w:t>
-      </w:r>
-      <w:r>
-        <w:rPr>
-          <w:rFonts w:ascii="Arial" w:cs="Arial" w:eastAsia="Arial" w:hAnsi="Arial"/>
-          <w:sz w:val="22"/>
-          <w:szCs w:val="22"/>
-          <w:highlight w:val="yellow"/>
-          <w:highlightCs w:val="yellow"/>
-        </w:rPr>
-        <w:t>17</w:t>
-      </w:r>
-      <w:r>
-        <w:rPr>
-          <w:rFonts w:ascii="Arial" w:cs="Arial" w:eastAsia="Arial" w:hAnsi="Arial"/>
-          <w:sz w:val="22"/>
-          <w:szCs w:val="22"/>
-        </w:rPr>
-        <w:t xml:space="preserve"> were caught only by the classifier and </w:t>
-      </w:r>
-      <w:r>
-        <w:rPr>
-          <w:rFonts w:ascii="Arial" w:cs="Arial" w:eastAsia="Arial" w:hAnsi="Arial"/>
-          <w:sz w:val="22"/>
-          <w:szCs w:val="22"/>
-          <w:highlight w:val="yellow"/>
-          <w:highlightCs w:val="yellow"/>
-        </w:rPr>
-        <w:t>17</w:t>
-      </w:r>
-      <w:r>
-        <w:rPr>
-          <w:rFonts w:ascii="Arial" w:cs="Arial" w:eastAsia="Arial" w:hAnsi="Arial"/>
-          <w:sz w:val="22"/>
-          <w:szCs w:val="22"/>
-        </w:rPr>
-        <w:t xml:space="preserve"> only by the report (Fig. 1c). We do not claim that the classifier is superior. The two readouts share an encoder yet made different errors, so the misses of the report pipeline cannot be read as misses of the encoder.</w:t>
+        <w:t>Read directly, the classifier separated urgent from non-urgent studies with an area under the receiver operating characteristic curve of 0.949 (95% CI 0.928–0.967; Fig. 1b). The report pipeline flagged 34.1% of studies and detected 73.3% of urgent studies. At the same flag rate, the classifier detected the same fraction (difference 0.000, 95% CI −0.029 to 0.030). Equal sensitivity did not mean identical errors. Of the 206 urgent studies, 134 were caught by both readouts and 38 by neither, while 17 were caught only by the classifier and 17 only by the report. We do not claim that the classifier is superior. The two readouts share an encoder yet made different errors, so the misses of the report pipeline cannot be read as misses of the encoder.</w:t>
       </w:r>
     </w:p>
     <w:p>

</xml_diff>

<commit_message>
Fig1c = full miss decomposition (40/10/5, old design); drop panel-b Δ text; reframe parity as 'equivalent' + explain complementary errors (17 report-only)
</commit_message>
<xml_diff>
--- a/incoming/edited/NeuroVFM_Matters_Arising_manuscript_FILLED.docx
+++ b/incoming/edited/NeuroVFM_Matters_Arising_manuscript_FILLED.docx
@@ -388,7 +388,7 @@
         <w:spacing w:after="200" w:line="276"/>
       </w:pPr>
       <w:r>
-        <w:t>Read directly, the classifier separated urgent from non-urgent studies with an area under the receiver operating characteristic curve of 0.949 (95% CI 0.928–0.967; Fig. 1b). The report pipeline flagged 34.1% of studies and detected 73.3% of urgent studies. At the same flag rate, the classifier detected the same fraction (difference 0.000, 95% CI −0.029 to 0.030). Equal sensitivity did not mean identical errors. Of the 206 urgent studies, 134 were caught by both readouts and 38 by neither, while 17 were caught only by the classifier and 17 only by the report. We do not claim that the classifier is superior. The two readouts share an encoder yet made different errors, so the misses of the report pipeline cannot be read as misses of the encoder.</w:t>
+        <w:t>Read directly, the classifier separated urgent from non-urgent studies with an area under the receiver operating characteristic curve of 0.949 (95% CI 0.928–0.967; Fig. 1b). At the report pipeline's flag rate, the two readouts detected the same fraction of urgent studies (73.3% each; difference 0.000, 95% CI −0.029 to 0.030) — equivalent sensitivity, which we note is not a claim that the classifier is the better triager. They did not, however, make the same errors: 17 urgent studies were caught only by the classifier and 17 only by the report pipeline, so each readout missed studies the other caught, and generation adds value for some findings. Because the two readouts share one encoder yet err differently, the misses of the report pipeline cannot be read as failures of the encoder, which we examine next.</w:t>
       </w:r>
     </w:p>
     <w:p>
@@ -1000,7 +1000,7 @@
         <w:t xml:space="preserve">Fig. 1. </w:t>
       </w:r>
       <w:r>
-        <w:t>NeuroVFM’s diagnostic classifier detects most urgent findings that its written reports omit, so report-based evaluation does not isolate perception. a, The released NeuroVFM system and the change we evaluated. One frozen encoder feeds two readouts that do not share information. In the original study, perception and triage were evaluated through the report path, in which a 14-billion-parameter language model writes findings that GPT-5 reads to assign acuity (orange). We also read the diagnostic classifier (about 0.95 million parameters) directly (blue). Shown for one CQ500 study with subarachnoid hemorrhage: the classifier scored the finding at 0.99 and flagged the study, whereas the generated report read “Study is unremarkable.” and the study was not escalated. b, Sensitivity for urgent studies versus fraction of studies flagged (n = 472, 206 urgent). Blue curve and band, the classifier’s highest score across the nine critical findings used directly as a triage score, with 95% CI (AUROC 0.949, 95% CI 0.928–0.967). Orange point, the report pipeline (sensitivity 0.733 at a flag rate of 0.341). Blue point, the classifier at the same flag rate, a threshold chosen without labels; the difference in sensitivity was 0.000 (95% CI −0.029 to 0.030). c, Classifier score on the missed finding for the 40 decoding misses — urgent studies the report pipeline missed in which the classifier scored the finding above 0.5 while the report named none of the study’s critical findings. Dotted line, 0.5; the median score was 0.92, and in 38 of the 40 the report named none of the nine critical findings. Confidence intervals in b are from 2,000 study-level bootstrap resamples.</w:t>
+        <w:t>NeuroVFM’s diagnostic classifier detects most urgent findings that its written reports omit, so report-based evaluation does not isolate perception. a, The released NeuroVFM system and the change we evaluated. One frozen encoder feeds two readouts that do not share information. In the original study, perception and triage were evaluated through the report path, in which a 14-billion-parameter language model writes findings that GPT-5 reads to assign acuity (orange). We also read the diagnostic classifier (about 0.95 million parameters) directly (blue). Shown for one CQ500 study with subarachnoid hemorrhage: the classifier scored the finding at 0.99 and flagged the study, whereas the generated report read “Study is unremarkable.” and the study was not escalated. b, Sensitivity for urgent studies versus fraction of studies flagged (n = 472, 206 urgent). Blue curve and band, the classifier’s highest score across the nine critical findings used directly as a triage score, with 95% CI (AUROC 0.949, 95% CI 0.928–0.967). Orange point, the report pipeline (sensitivity 0.733 at a flag rate of 0.341). Blue point, the classifier at the same flag rate, a threshold chosen without labels; the difference in sensitivity was 0.000 (95% CI −0.029 to 0.030). c, Decomposition of the 55 urgent studies the report pipeline missed. Of these, 40 are decoding misses, in which the classifier scored the missed finding above 0.5 while the report named none of the study’s critical findings; 10 are perception misses, missed by both readouts; and 5 are reasoning misses, in which the report named a critical finding that GPT-5 did not escalate. Below, the classifier’s score on the missed finding for the 40 decoding misses (dotted line, 0.5; median 0.92); in 38 of the 40 the report named none of the nine critical findings. Confidence intervals in b are from 2,000 study-level bootstrap resamples.</w:t>
       </w:r>
     </w:p>
     <w:p>

</xml_diff>

<commit_message>
Fig1c -> JAMA-style 40/15 bar + funnel to scores; focus on report misses the classifier caught; full decomposition kept in ED Fig 1
</commit_message>
<xml_diff>
--- a/incoming/edited/NeuroVFM_Matters_Arising_manuscript_FILLED.docx
+++ b/incoming/edited/NeuroVFM_Matters_Arising_manuscript_FILLED.docx
@@ -396,7 +396,7 @@
         <w:spacing w:after="200" w:line="276"/>
       </w:pPr>
       <w:r>
-        <w:t>The misses of the report pipeline show where information was lost. Of the 55 urgent studies it missed, 5 had a report that named a critical finding that GPT-5 did not escalate. Of the remainder, in 40 the classifier scored the missed finding above 0.5 (median 0.92) while the report named none of the study’s critical findings (Fig. 1c), and in 10 the classifier also scored the finding at or below 0.5. Most of these silent reports read as explicitly normal, for example, “Study is unremarkable.” They were complete outputs rather than truncated or empty generations, and the language model had received the same bone window as the classifier. The omitted findings included calvarial fracture, intraparenchymal hemorrhage, subdural hematoma and mass effect (Extended Data Fig. 1). A normal-reading report is more consequential than a missing flag, because it reassures and moves a scan down the worklist. Under the original evaluation these studies would count as failures of perception, although the encoder had represented the finding.</w:t>
+        <w:t>The misses of the report pipeline show where information was lost. Of the 55 urgent studies it missed, in 40 the classifier had already scored the missed finding above 0.5 (median 0.92) while the report named none of the study’s critical findings (Fig. 1c). Most of these silent reports read as explicitly normal, for example, “Study is unremarkable.” They were complete outputs rather than truncated or empty generations, and the language model had received the same bone window as the classifier. The omitted findings included calvarial fracture, intraparenchymal hemorrhage, subdural hematoma and mass effect. A normal-reading report is more consequential than a missing flag, because it reassures and moves a scan down the worklist. Under the original evaluation these studies would count as failures of perception, although the encoder had represented the finding. The remaining 15 misses are decomposed in Extended Data Fig. 1.</w:t>
       </w:r>
     </w:p>
     <w:p>
@@ -1000,7 +1000,7 @@
         <w:t xml:space="preserve">Fig. 1. </w:t>
       </w:r>
       <w:r>
-        <w:t>NeuroVFM’s diagnostic classifier detects most urgent findings that its written reports omit, so report-based evaluation does not isolate perception. a, The released NeuroVFM system and the change we evaluated. One frozen encoder feeds two readouts that do not share information. In the original study, perception and triage were evaluated through the report path, in which a 14-billion-parameter language model writes findings that GPT-5 reads to assign acuity (orange). We also read the diagnostic classifier (about 0.95 million parameters) directly (blue). Shown for one CQ500 study with subarachnoid hemorrhage: the classifier scored the finding at 0.99 and flagged the study, whereas the generated report read “Study is unremarkable.” and the study was not escalated. b, Sensitivity for urgent studies versus fraction of studies flagged (n = 472, 206 urgent). Blue curve and band, the classifier’s highest score across the nine critical findings used directly as a triage score, with 95% CI (AUROC 0.949, 95% CI 0.928–0.967). Orange point, the report pipeline (sensitivity 0.733 at a flag rate of 0.341). Blue point, the classifier at the same flag rate, a threshold chosen without labels; the difference in sensitivity was 0.000 (95% CI −0.029 to 0.030). c, Decomposition of the 55 urgent studies the report pipeline missed. Of these, 40 are decoding misses, in which the classifier scored the missed finding above 0.5 while the report named none of the study’s critical findings; 10 are perception misses, missed by both readouts; and 5 are reasoning misses, in which the report named a critical finding that GPT-5 did not escalate. Below, the classifier’s score on the missed finding for the 40 decoding misses (dotted line, 0.5; median 0.92); in 38 of the 40 the report named none of the nine critical findings. Confidence intervals in b are from 2,000 study-level bootstrap resamples.</w:t>
+        <w:t>NeuroVFM’s diagnostic classifier detects most urgent findings that its written reports omit, so report-based evaluation does not isolate perception. a, The released NeuroVFM system and the change we evaluated. One frozen encoder feeds two readouts that do not share information. In the original study, perception and triage were evaluated through the report path, in which a 14-billion-parameter language model writes findings that GPT-5 reads to assign acuity (orange). We also read the diagnostic classifier (about 0.95 million parameters) directly (blue). Shown for one CQ500 study with subarachnoid hemorrhage: the classifier scored the finding at 0.99 and flagged the study, whereas the generated report read “Study is unremarkable.” and the study was not escalated. b, Sensitivity for urgent studies versus fraction of studies flagged (n = 472, 206 urgent). Blue curve and band, the classifier’s highest score across the nine critical findings used directly as a triage score, with 95% CI (AUROC 0.949, 95% CI 0.928–0.967). Orange point, the report pipeline (sensitivity 0.733 at a flag rate of 0.341). Blue point, the classifier at the same flag rate, a threshold chosen without labels; the difference in sensitivity was 0.000 (95% CI −0.029 to 0.030). c, Of the 55 urgent studies the report pipeline missed, in 40 (blue) the classifier had already scored the missed finding above 0.5 while the report named none of the study’s critical findings; lines connect this group to their classifier scores below (dotted line, 0.5; median 0.92). In 38 of the 40 the report named none of the nine critical findings. The full decomposition of the 55 misses is in Extended Data Fig. 1. Confidence intervals in b are from 2,000 study-level bootstrap resamples.</w:t>
       </w:r>
     </w:p>
     <w:p>

</xml_diff>

<commit_message>
Fill final tokens: indication ablation (38/40 persist; headache worsens to 47 decoding) + determinism (40/40 verbatim). Manuscript now token-complete (950 words)
</commit_message>
<xml_diff>
--- a/incoming/edited/NeuroVFM_Matters_Arising_manuscript_FILLED.docx
+++ b/incoming/edited/NeuroVFM_Matters_Arising_manuscript_FILLED.docx
@@ -472,7 +472,7 @@
           <w:highlight w:val="yellow"/>
           <w:highlightCs w:val="yellow"/>
         </w:rPr>
-        <w:t xml:space="preserve">{{ABLATION_RESULT}}</w:t>
+        <w:t>38 of the 40 decoding misses persisted under each of a “head trauma” and a “headache” indication (37 under both), the report pipeline’s sensitivity for urgent studies did not improve (0.733 with no indication, 0.728 with head trauma, 0.694 with headache), and the classifier’s was unchanged at 0.733</w:t>
       </w:r>
       <w:r>
         <w:rPr>
@@ -1065,7 +1065,7 @@
           <w:highlight w:val="yellow"/>
           <w:highlightCs w:val="yellow"/>
         </w:rPr>
-        <w:t xml:space="preserve">{{ED2_ABLATION_SUMMARY}}</w:t>
+        <w:t>no indication, 40 decoding, 10 perception and 5 reasoning of 55 misses; head trauma, 40 decoding, 10 perception and 6 reasoning of 56; headache, 47 decoding, 11 perception and 5 reasoning of 63; 38 of the 40 decoding misses in the main analysis persisted under each indication</w:t>
       </w:r>
       <w:r>
         <w:rPr>
@@ -1546,7 +1546,7 @@
           <w:highlight w:val="yellow"/>
           <w:highlightCs w:val="yellow"/>
         </w:rPr>
-        <w:t xml:space="preserve">{{DETERMINISM_RESULT}}</w:t>
+        <w:t>all 40 reproduced verbatim, confirming the omissions are deterministic under the model’s greedy decoding rather than sampling artefacts</w:t>
       </w:r>
       <w:r>
         <w:rPr>

</xml_diff>